<commit_message>
complete project submission week 1 to week 7
Course: BIT4107 Mobile Application Development
Student Name: John Njoroge Gachanja
Admission Number: BIT/2024/74648

This upload contains the finalized 'Vault Student Hub' source code and logbook deliverables tracking all milestones from Week 1 through Week 7:
- Weeks 1-3: Environment setup, navigation, and Dark UI Dashboard layout.
- Week 4: Event handling and local data CRUD mechanisms.
- Weeks 5-6: Asynchronous processing and JSON REST API consumption features.
- Week 7: Relational database structures and the Student Attendance Tracking module.
-
</commit_message>
<xml_diff>
--- a/LOGBOOK MOBILE APP DEVELOPMENT.docx
+++ b/LOGBOOK MOBILE APP DEVELOPMENT.docx
@@ -13,6 +13,7 @@
     <w:p>
       <w:pPr>
         <w:rPr>
+          <w:rFonts w:ascii="Bodoni MT Black" w:hAnsi="Bodoni MT Black"/>
           <w:b/>
           <w:bCs/>
           <w:u w:val="single"/>
@@ -20,6 +21,7 @@
       </w:pPr>
       <w:r>
         <w:rPr>
+          <w:rFonts w:ascii="Bodoni MT Black" w:hAnsi="Bodoni MT Black"/>
           <w:b/>
           <w:bCs/>
           <w:u w:val="single"/>
@@ -28,155 +30,284 @@
       </w:r>
     </w:p>
     <w:p>
-      <w:r>
-        <w:rPr>
+      <w:pPr>
+        <w:rPr>
+          <w:rFonts w:ascii="Bodoni MT Black" w:hAnsi="Bodoni MT Black"/>
+        </w:rPr>
+      </w:pPr>
+      <w:r>
+        <w:rPr>
+          <w:rFonts w:ascii="Bodoni MT Black" w:hAnsi="Bodoni MT Black"/>
           <w:b/>
           <w:bCs/>
         </w:rPr>
         <w:t>Student Name</w:t>
       </w:r>
       <w:r>
+        <w:rPr>
+          <w:rFonts w:ascii="Bodoni MT Black" w:hAnsi="Bodoni MT Black"/>
+        </w:rPr>
         <w:t>: ______</w:t>
       </w:r>
       <w:r>
+        <w:rPr>
+          <w:rFonts w:ascii="Bodoni MT Black" w:hAnsi="Bodoni MT Black"/>
+        </w:rPr>
         <w:t>John Njoroge</w:t>
       </w:r>
       <w:r>
+        <w:rPr>
+          <w:rFonts w:ascii="Bodoni MT Black" w:hAnsi="Bodoni MT Black"/>
+        </w:rPr>
         <w:t>________________________</w:t>
       </w:r>
     </w:p>
     <w:p>
-      <w:r>
-        <w:rPr>
+      <w:pPr>
+        <w:rPr>
+          <w:rFonts w:ascii="Bodoni MT Black" w:hAnsi="Bodoni MT Black"/>
+        </w:rPr>
+      </w:pPr>
+      <w:r>
+        <w:rPr>
+          <w:rFonts w:ascii="Bodoni MT Black" w:hAnsi="Bodoni MT Black"/>
           <w:b/>
           <w:bCs/>
         </w:rPr>
         <w:t>Admission Number</w:t>
       </w:r>
       <w:r>
+        <w:rPr>
+          <w:rFonts w:ascii="Bodoni MT Black" w:hAnsi="Bodoni MT Black"/>
+        </w:rPr>
         <w:t xml:space="preserve">: </w:t>
       </w:r>
       <w:r>
+        <w:rPr>
+          <w:rFonts w:ascii="Bodoni MT Black" w:hAnsi="Bodoni MT Black"/>
+        </w:rPr>
         <w:t>BIT/2024/74648</w:t>
       </w:r>
       <w:r>
+        <w:rPr>
+          <w:rFonts w:ascii="Bodoni MT Black" w:hAnsi="Bodoni MT Black"/>
+        </w:rPr>
         <w:t>______________________________</w:t>
       </w:r>
     </w:p>
     <w:p>
-      <w:r>
-        <w:rPr>
+      <w:pPr>
+        <w:rPr>
+          <w:rFonts w:ascii="Bodoni MT Black" w:hAnsi="Bodoni MT Black"/>
+        </w:rPr>
+      </w:pPr>
+      <w:r>
+        <w:rPr>
+          <w:rFonts w:ascii="Bodoni MT Black" w:hAnsi="Bodoni MT Black"/>
           <w:b/>
           <w:bCs/>
         </w:rPr>
         <w:t>School/Faculty</w:t>
       </w:r>
       <w:r>
+        <w:rPr>
+          <w:rFonts w:ascii="Bodoni MT Black" w:hAnsi="Bodoni MT Black"/>
+        </w:rPr>
         <w:t>: _____</w:t>
       </w:r>
       <w:r>
-        <w:t>School of computing and infotmatics</w:t>
-      </w:r>
-      <w:r>
+        <w:rPr>
+          <w:rFonts w:ascii="Bodoni MT Black" w:hAnsi="Bodoni MT Black"/>
+        </w:rPr>
+        <w:t xml:space="preserve">School of computing and </w:t>
+      </w:r>
+      <w:r>
+        <w:rPr>
+          <w:rFonts w:ascii="Bodoni MT Black" w:hAnsi="Bodoni MT Black"/>
+        </w:rPr>
+        <w:t>informatics</w:t>
+      </w:r>
+      <w:r>
+        <w:rPr>
+          <w:rFonts w:ascii="Bodoni MT Black" w:hAnsi="Bodoni MT Black"/>
+        </w:rPr>
         <w:t>_________________________</w:t>
       </w:r>
     </w:p>
     <w:p>
-      <w:r>
-        <w:rPr>
+      <w:pPr>
+        <w:rPr>
+          <w:rFonts w:ascii="Bodoni MT Black" w:hAnsi="Bodoni MT Black"/>
+        </w:rPr>
+      </w:pPr>
+      <w:r>
+        <w:rPr>
+          <w:rFonts w:ascii="Bodoni MT Black" w:hAnsi="Bodoni MT Black"/>
           <w:b/>
           <w:bCs/>
         </w:rPr>
         <w:t>Programme</w:t>
       </w:r>
       <w:r>
+        <w:rPr>
+          <w:rFonts w:ascii="Bodoni MT Black" w:hAnsi="Bodoni MT Black"/>
+        </w:rPr>
         <w:t>: ____</w:t>
       </w:r>
       <w:r>
+        <w:rPr>
+          <w:rFonts w:ascii="Bodoni MT Black" w:hAnsi="Bodoni MT Black"/>
+        </w:rPr>
         <w:t>Bachelor of science in information technology</w:t>
       </w:r>
       <w:r>
+        <w:rPr>
+          <w:rFonts w:ascii="Bodoni MT Black" w:hAnsi="Bodoni MT Black"/>
+        </w:rPr>
         <w:t>__________________________</w:t>
       </w:r>
     </w:p>
     <w:p>
-      <w:r>
-        <w:rPr>
+      <w:pPr>
+        <w:rPr>
+          <w:rFonts w:ascii="Bodoni MT Black" w:hAnsi="Bodoni MT Black"/>
+        </w:rPr>
+      </w:pPr>
+      <w:r>
+        <w:rPr>
+          <w:rFonts w:ascii="Bodoni MT Black" w:hAnsi="Bodoni MT Black"/>
           <w:b/>
           <w:bCs/>
         </w:rPr>
         <w:t>Academic Year</w:t>
       </w:r>
       <w:r>
+        <w:rPr>
+          <w:rFonts w:ascii="Bodoni MT Black" w:hAnsi="Bodoni MT Black"/>
+        </w:rPr>
         <w:t>: ___________</w:t>
       </w:r>
       <w:r>
+        <w:rPr>
+          <w:rFonts w:ascii="Bodoni MT Black" w:hAnsi="Bodoni MT Black"/>
+        </w:rPr>
         <w:t>2025/2026</w:t>
       </w:r>
       <w:r>
+        <w:rPr>
+          <w:rFonts w:ascii="Bodoni MT Black" w:hAnsi="Bodoni MT Black"/>
+        </w:rPr>
         <w:t>___________________</w:t>
       </w:r>
     </w:p>
     <w:p>
-      <w:r>
-        <w:rPr>
+      <w:pPr>
+        <w:rPr>
+          <w:rFonts w:ascii="Bodoni MT Black" w:hAnsi="Bodoni MT Black"/>
+        </w:rPr>
+      </w:pPr>
+      <w:r>
+        <w:rPr>
+          <w:rFonts w:ascii="Bodoni MT Black" w:hAnsi="Bodoni MT Black"/>
           <w:b/>
           <w:bCs/>
         </w:rPr>
         <w:t>Semester</w:t>
       </w:r>
       <w:r>
+        <w:rPr>
+          <w:rFonts w:ascii="Bodoni MT Black" w:hAnsi="Bodoni MT Black"/>
+        </w:rPr>
         <w:t>: __</w:t>
       </w:r>
       <w:r>
+        <w:rPr>
+          <w:rFonts w:ascii="Bodoni MT Black" w:hAnsi="Bodoni MT Black"/>
+        </w:rPr>
         <w:t>May/Aug 2026</w:t>
       </w:r>
       <w:r>
+        <w:rPr>
+          <w:rFonts w:ascii="Bodoni MT Black" w:hAnsi="Bodoni MT Black"/>
+        </w:rPr>
         <w:t>_</w:t>
       </w:r>
       <w:r>
+        <w:rPr>
+          <w:rFonts w:ascii="Bodoni MT Black" w:hAnsi="Bodoni MT Black"/>
+        </w:rPr>
         <w:t>(3.2)</w:t>
       </w:r>
       <w:r>
+        <w:rPr>
+          <w:rFonts w:ascii="Bodoni MT Black" w:hAnsi="Bodoni MT Black"/>
+        </w:rPr>
         <w:t>___________________________</w:t>
       </w:r>
     </w:p>
     <w:p>
-      <w:r>
-        <w:rPr>
+      <w:pPr>
+        <w:rPr>
+          <w:rFonts w:ascii="Bodoni MT Black" w:hAnsi="Bodoni MT Black"/>
+        </w:rPr>
+      </w:pPr>
+      <w:r>
+        <w:rPr>
+          <w:rFonts w:ascii="Bodoni MT Black" w:hAnsi="Bodoni MT Black"/>
           <w:b/>
           <w:bCs/>
         </w:rPr>
         <w:t>Lecturer</w:t>
       </w:r>
       <w:r>
+        <w:rPr>
+          <w:rFonts w:ascii="Bodoni MT Black" w:hAnsi="Bodoni MT Black"/>
+        </w:rPr>
         <w:t>: _______</w:t>
       </w:r>
       <w:r>
-        <w:t>Mr.</w:t>
-      </w:r>
-      <w:r>
-        <w:t>Nyoro</w:t>
-      </w:r>
-      <w:r>
+        <w:rPr>
+          <w:rFonts w:ascii="Bodoni MT Black" w:hAnsi="Bodoni MT Black"/>
+        </w:rPr>
+        <w:t>Mr. Nyoro</w:t>
+      </w:r>
+      <w:r>
+        <w:rPr>
+          <w:rFonts w:ascii="Bodoni MT Black" w:hAnsi="Bodoni MT Black"/>
+        </w:rPr>
         <w:t>_____________________</w:t>
       </w:r>
     </w:p>
     <w:p>
-      <w:r>
-        <w:rPr>
+      <w:pPr>
+        <w:rPr>
+          <w:rFonts w:ascii="Bodoni MT Black" w:hAnsi="Bodoni MT Black"/>
+        </w:rPr>
+      </w:pPr>
+      <w:r>
+        <w:rPr>
+          <w:rFonts w:ascii="Bodoni MT Black" w:hAnsi="Bodoni MT Black"/>
           <w:b/>
           <w:bCs/>
         </w:rPr>
         <w:t>Phone Number</w:t>
       </w:r>
       <w:r>
+        <w:rPr>
+          <w:rFonts w:ascii="Bodoni MT Black" w:hAnsi="Bodoni MT Black"/>
+        </w:rPr>
         <w:t>: ___</w:t>
       </w:r>
       <w:r>
+        <w:rPr>
+          <w:rFonts w:ascii="Bodoni MT Black" w:hAnsi="Bodoni MT Black"/>
+        </w:rPr>
         <w:t>0798740383</w:t>
       </w:r>
       <w:r>
+        <w:rPr>
+          <w:rFonts w:ascii="Bodoni MT Black" w:hAnsi="Bodoni MT Black"/>
+        </w:rPr>
         <w:t>___________________________</w:t>
       </w:r>
     </w:p>
@@ -216,23 +347,47 @@
     <w:p>
       <w:pPr>
         <w:pStyle w:val="Heading1"/>
-      </w:pPr>
-      <w:r>
+        <w:rPr>
+          <w:sz w:val="36"/>
+          <w:szCs w:val="36"/>
+          <w:u w:val="single"/>
+        </w:rPr>
+      </w:pPr>
+      <w:r>
+        <w:rPr>
+          <w:sz w:val="36"/>
+          <w:szCs w:val="36"/>
+          <w:u w:val="single"/>
+        </w:rPr>
         <w:lastRenderedPageBreak/>
         <w:t>Week 1: Introduction to Mobile Application Developmen</w:t>
       </w:r>
       <w:r>
+        <w:rPr>
+          <w:sz w:val="36"/>
+          <w:szCs w:val="36"/>
+          <w:u w:val="single"/>
+        </w:rPr>
+        <w:t>t</w:t>
+      </w:r>
+      <w:r>
+        <w:rPr>
+          <w:sz w:val="36"/>
+          <w:szCs w:val="36"/>
+          <w:u w:val="single"/>
+        </w:rPr>
         <w:br/>
       </w:r>
-    </w:p>
-    <w:p>
-      <w:pPr>
-        <w:pStyle w:val="Heading2"/>
-      </w:pPr>
-      <w:r>
+      <w:r>
+        <w:rPr>
+          <w:u w:val="single"/>
+        </w:rPr>
         <w:t>Practical Activities Undertake</w:t>
       </w:r>
       <w:r>
+        <w:rPr>
+          <w:u w:val="single"/>
+        </w:rPr>
         <w:t>n</w:t>
       </w:r>
     </w:p>
@@ -241,7 +396,13 @@
         <w:t>Studied the fundamentals of mobile</w:t>
       </w:r>
       <w:r>
-        <w:t xml:space="preserve"> development architectures.Analyzed the structural differences between native frame works and cross platform ecosystems like flutter.</w:t>
+        <w:t xml:space="preserve"> development </w:t>
+      </w:r>
+      <w:r>
+        <w:t>architectures. Analyzed</w:t>
+      </w:r>
+      <w:r>
+        <w:t xml:space="preserve"> the structural differences between native frame works and cross platform ecosystems like flutter.</w:t>
       </w:r>
     </w:p>
     <w:p>
@@ -303,8 +464,14 @@
     <w:p>
       <w:pPr>
         <w:pStyle w:val="Heading2"/>
-      </w:pPr>
-      <w:r>
+        <w:rPr>
+          <w:u w:val="single"/>
+        </w:rPr>
+      </w:pPr>
+      <w:r>
+        <w:rPr>
+          <w:u w:val="single"/>
+        </w:rPr>
         <w:t>Tools/Software Used</w:t>
       </w:r>
     </w:p>
@@ -316,21 +483,39 @@
     <w:p>
       <w:r>
         <w:rPr>
+          <w:rFonts w:asciiTheme="minorHAnsi" w:hAnsiTheme="minorHAnsi" w:cstheme="minorHAnsi"/>
+          <w:b/>
+          <w:bCs/>
+          <w:color w:val="4F81BD" w:themeColor="accent1"/>
+          <w:sz w:val="24"/>
+          <w:szCs w:val="24"/>
           <w:u w:val="single"/>
         </w:rPr>
-        <w:t>Personal Reflection</w:t>
-      </w:r>
-      <w:r>
-        <w:rPr>
+        <w:t xml:space="preserve">Personal </w:t>
+      </w:r>
+      <w:r>
+        <w:rPr>
+          <w:rFonts w:asciiTheme="minorHAnsi" w:hAnsiTheme="minorHAnsi" w:cstheme="minorHAnsi"/>
+          <w:b/>
+          <w:bCs/>
+          <w:color w:val="4F81BD" w:themeColor="accent1"/>
+          <w:sz w:val="24"/>
+          <w:szCs w:val="24"/>
           <w:u w:val="single"/>
         </w:rPr>
-        <w:t>,</w:t>
+        <w:t>Reflection</w:t>
       </w:r>
       <w:r>
         <w:rPr>
           <w:u w:val="single"/>
         </w:rPr>
-        <w:t>not more than 50 words</w:t>
+        <w:t>, not</w:t>
+      </w:r>
+      <w:r>
+        <w:rPr>
+          <w:u w:val="single"/>
+        </w:rPr>
+        <w:t xml:space="preserve"> more than 50 words</w:t>
       </w:r>
       <w:r>
         <w:t xml:space="preserve"> </w:t>
@@ -339,7 +524,13 @@
         <w:br/>
       </w:r>
       <w:r>
-        <w:t>Gained a solid understanding of how flutter compiles to native arm code,making cross platform uis highly performant</w:t>
+        <w:t xml:space="preserve">Gained a solid understanding of how flutter compiles to native arm </w:t>
+      </w:r>
+      <w:r>
+        <w:t>code, making</w:t>
+      </w:r>
+      <w:r>
+        <w:t xml:space="preserve"> cross platform uis highly performant</w:t>
       </w:r>
       <w:r>
         <w:br/>
@@ -390,6 +581,7 @@
         <w:br/>
       </w:r>
       <w:r>
+        <w:lastRenderedPageBreak/>
         <w:br/>
       </w:r>
     </w:p>
@@ -401,8 +593,18 @@
     <w:p>
       <w:pPr>
         <w:pStyle w:val="Heading1"/>
-      </w:pPr>
-      <w:r>
+        <w:rPr>
+          <w:sz w:val="32"/>
+          <w:szCs w:val="32"/>
+          <w:u w:val="single"/>
+        </w:rPr>
+      </w:pPr>
+      <w:r>
+        <w:rPr>
+          <w:sz w:val="32"/>
+          <w:szCs w:val="32"/>
+          <w:u w:val="single"/>
+        </w:rPr>
         <w:lastRenderedPageBreak/>
         <w:t>Week 2: Mobile Development Environment</w:t>
       </w:r>
@@ -456,19 +658,54 @@
     </w:p>
     <w:p>
       <w:r>
-        <w:t>Tools/Software Used: Android Studio, Flutter SDK, Command Prompt/Terminal.</w:t>
-      </w:r>
-    </w:p>
-    <w:p>
-      <w:r>
-        <w:t>​Personal Reflection: Configuring path variables taught me how development environments communicate with the underlying operating system tools effectively.</w:t>
+        <w:rPr>
+          <w:b/>
+          <w:bCs/>
+          <w:color w:val="4F81BD" w:themeColor="accent1"/>
+          <w:sz w:val="24"/>
+          <w:szCs w:val="24"/>
+          <w:u w:val="single"/>
+        </w:rPr>
+        <w:t>Tools/Software Used</w:t>
+      </w:r>
+      <w:r>
+        <w:t>: Android Studio, Flutter SDK, Command Prompt/Terminal.</w:t>
+      </w:r>
+    </w:p>
+    <w:p>
+      <w:r>
+        <w:t>​</w:t>
+      </w:r>
+      <w:r>
+        <w:rPr>
+          <w:b/>
+          <w:bCs/>
+          <w:color w:val="4F81BD" w:themeColor="accent1"/>
+          <w:sz w:val="24"/>
+          <w:szCs w:val="24"/>
+          <w:u w:val="single"/>
+        </w:rPr>
+        <w:t>Personal Reflection</w:t>
+      </w:r>
+      <w:r>
+        <w:t>: Configuring path variables taught me how development environments communicate with the underlying operating system tools effectively.</w:t>
       </w:r>
     </w:p>
     <w:p>
       <w:pPr>
         <w:pStyle w:val="Heading1"/>
-      </w:pPr>
-      <w:r>
+        <w:rPr>
+          <w:sz w:val="32"/>
+          <w:szCs w:val="32"/>
+          <w:u w:val="single"/>
+        </w:rPr>
+      </w:pPr>
+      <w:r>
+        <w:rPr>
+          <w:sz w:val="32"/>
+          <w:szCs w:val="32"/>
+          <w:u w:val="single"/>
+        </w:rPr>
         <w:lastRenderedPageBreak/>
         <w:t>Week 3: User Interface Design</w:t>
       </w:r>
@@ -483,7 +720,13 @@
         </w:rPr>
       </w:pPr>
       <w:r>
-        <w:t xml:space="preserve">Practical Activities Undertaken: </w:t>
+        <w:rPr>
+          <w:u w:val="single"/>
+        </w:rPr>
+        <w:t>Practical Activities Undertaken</w:t>
+      </w:r>
+      <w:r>
+        <w:t xml:space="preserve">: </w:t>
       </w:r>
       <w:r>
         <w:rPr>
@@ -499,7 +742,16 @@
         <w:pStyle w:val="Heading2"/>
       </w:pPr>
       <w:r>
-        <w:t xml:space="preserve">​Screenshots/Evidence Attached: </w:t>
+        <w:t>​</w:t>
+      </w:r>
+      <w:r>
+        <w:rPr>
+          <w:u w:val="single"/>
+        </w:rPr>
+        <w:t>Screenshots/Evidence Attached:</w:t>
+      </w:r>
+      <w:r>
+        <w:t xml:space="preserve"> </w:t>
       </w:r>
       <w:r>
         <w:rPr>
@@ -633,7 +885,13 @@
         <w:pStyle w:val="Heading2"/>
       </w:pPr>
       <w:r>
-        <w:t>​Tools/Software Used</w:t>
+        <w:t>​</w:t>
+      </w:r>
+      <w:r>
+        <w:rPr>
+          <w:u w:val="single"/>
+        </w:rPr>
+        <w:t>Tools/Software Used</w:t>
       </w:r>
       <w:r>
         <w:rPr>
@@ -652,7 +910,16 @@
         <w:pStyle w:val="Heading2"/>
       </w:pPr>
       <w:r>
-        <w:t xml:space="preserve">​Personal Reflection: </w:t>
+        <w:t>​</w:t>
+      </w:r>
+      <w:r>
+        <w:rPr>
+          <w:u w:val="single"/>
+        </w:rPr>
+        <w:t>Personal Reflection</w:t>
+      </w:r>
+      <w:r>
+        <w:t xml:space="preserve">: </w:t>
       </w:r>
       <w:r>
         <w:rPr>
@@ -660,7 +927,39 @@
           <w:bCs w:val="0"/>
           <w:color w:val="000000" w:themeColor="text1"/>
         </w:rPr>
-        <w:t>Learned to utilize responsive Flutter widgets like LayoutBuilder, GridView, and custom Cards to create an adaptive application shell matching Figma layouts</w:t>
+        <w:t xml:space="preserve">Learned to utilize responsive Flutter widgets like </w:t>
+      </w:r>
+      <w:r>
+        <w:rPr>
+          <w:b w:val="0"/>
+          <w:bCs w:val="0"/>
+          <w:color w:val="000000" w:themeColor="text1"/>
+        </w:rPr>
+        <w:t>Layout Builder</w:t>
+      </w:r>
+      <w:r>
+        <w:rPr>
+          <w:b w:val="0"/>
+          <w:bCs w:val="0"/>
+          <w:color w:val="000000" w:themeColor="text1"/>
+        </w:rPr>
+        <w:t xml:space="preserve">, </w:t>
+      </w:r>
+      <w:r>
+        <w:rPr>
+          <w:b w:val="0"/>
+          <w:bCs w:val="0"/>
+          <w:color w:val="000000" w:themeColor="text1"/>
+        </w:rPr>
+        <w:t>Grid View</w:t>
+      </w:r>
+      <w:r>
+        <w:rPr>
+          <w:b w:val="0"/>
+          <w:bCs w:val="0"/>
+          <w:color w:val="000000" w:themeColor="text1"/>
+        </w:rPr>
+        <w:t>, and custom Cards to create an adaptive application shell matching Figma layouts</w:t>
       </w:r>
       <w:r>
         <w:t>.</w:t>
@@ -697,8 +996,18 @@
     <w:p>
       <w:pPr>
         <w:pStyle w:val="Heading1"/>
-      </w:pPr>
-      <w:r>
+        <w:rPr>
+          <w:sz w:val="32"/>
+          <w:szCs w:val="32"/>
+          <w:u w:val="single"/>
+        </w:rPr>
+      </w:pPr>
+      <w:r>
+        <w:rPr>
+          <w:sz w:val="32"/>
+          <w:szCs w:val="32"/>
+          <w:u w:val="single"/>
+        </w:rPr>
         <w:lastRenderedPageBreak/>
         <w:t>Week 4: Event Handling and User Interaction</w:t>
       </w:r>
@@ -708,7 +1017,13 @@
         <w:pStyle w:val="Heading2"/>
       </w:pPr>
       <w:r>
-        <w:t xml:space="preserve">Practical Activities Undertaken: </w:t>
+        <w:rPr>
+          <w:u w:val="single"/>
+        </w:rPr>
+        <w:t>Practical Activities Undertaken</w:t>
+      </w:r>
+      <w:r>
+        <w:t xml:space="preserve">: </w:t>
       </w:r>
       <w:r>
         <w:rPr>
@@ -725,9 +1040,18 @@
     <w:p>
       <w:pPr>
         <w:pStyle w:val="Heading2"/>
-      </w:pPr>
-      <w:r>
-        <w:t>​Screenshots/Evidence Attached:</w:t>
+        <w:rPr>
+          <w:u w:val="single"/>
+        </w:rPr>
+      </w:pPr>
+      <w:r>
+        <w:t>​</w:t>
+      </w:r>
+      <w:r>
+        <w:rPr>
+          <w:u w:val="single"/>
+        </w:rPr>
+        <w:t>Screenshots/Evidence Attached:</w:t>
       </w:r>
     </w:p>
     <w:p>
@@ -735,6 +1059,9 @@
         <w:pStyle w:val="Heading2"/>
       </w:pPr>
       <w:r>
+        <w:rPr>
+          <w:u w:val="single"/>
+        </w:rPr>
         <w:t xml:space="preserve"> </w:t>
       </w:r>
       <w:r>
@@ -783,7 +1110,16 @@
         <w:pStyle w:val="Heading2"/>
       </w:pPr>
       <w:r>
-        <w:t xml:space="preserve">​Tools/Software Used: </w:t>
+        <w:t>​</w:t>
+      </w:r>
+      <w:r>
+        <w:rPr>
+          <w:u w:val="single"/>
+        </w:rPr>
+        <w:t>Tools/Software Used</w:t>
+      </w:r>
+      <w:r>
+        <w:t xml:space="preserve">: </w:t>
       </w:r>
       <w:r>
         <w:rPr>
@@ -799,7 +1135,16 @@
         <w:pStyle w:val="Heading2"/>
       </w:pPr>
       <w:r>
-        <w:t xml:space="preserve">​Personal Reflection: </w:t>
+        <w:t>​</w:t>
+      </w:r>
+      <w:r>
+        <w:rPr>
+          <w:u w:val="single"/>
+        </w:rPr>
+        <w:t>Personal Reflection</w:t>
+      </w:r>
+      <w:r>
+        <w:t xml:space="preserve">: </w:t>
       </w:r>
       <w:r>
         <w:rPr>
@@ -837,8 +1182,18 @@
     <w:p>
       <w:pPr>
         <w:pStyle w:val="Heading1"/>
-      </w:pPr>
-      <w:r>
+        <w:rPr>
+          <w:sz w:val="32"/>
+          <w:szCs w:val="32"/>
+          <w:u w:val="single"/>
+        </w:rPr>
+      </w:pPr>
+      <w:r>
+        <w:rPr>
+          <w:sz w:val="32"/>
+          <w:szCs w:val="32"/>
+          <w:u w:val="single"/>
+        </w:rPr>
         <w:lastRenderedPageBreak/>
         <w:t>Week 5: Data Management</w:t>
       </w:r>
@@ -848,15 +1203,62 @@
         <w:pStyle w:val="Heading2"/>
       </w:pPr>
       <w:r>
-        <w:t>​Practical Activities Undertaken</w:t>
+        <w:t>​</w:t>
+      </w:r>
+      <w:r>
+        <w:rPr>
+          <w:u w:val="single"/>
+        </w:rPr>
+        <w:t>Practical Activities Undertaken</w:t>
       </w:r>
       <w:r>
         <w:rPr>
           <w:b w:val="0"/>
           <w:bCs w:val="0"/>
           <w:color w:val="auto"/>
-        </w:rPr>
-        <w:t>: Engineered an in-memory structural database map array to simulate local relational database CRUD operations (Create, Read, Update, Delete) for student records. Constructed asynchronous thread handlers using Future.delayed to prevent layout freezing during network simulation calls. Used the dart:convert serialization layer to decode raw structural JSON data streams into presentation-ready card lists</w:t>
+          <w:u w:val="single"/>
+        </w:rPr>
+        <w:t>:</w:t>
+      </w:r>
+      <w:r>
+        <w:rPr>
+          <w:b w:val="0"/>
+          <w:bCs w:val="0"/>
+          <w:color w:val="auto"/>
+        </w:rPr>
+        <w:t xml:space="preserve"> Engineered an in-memory structural database map array to simulate local relational database CRUD operations (Create, Read, Update, Delete) for student records. Constructed asynchronous thread handlers using </w:t>
+      </w:r>
+      <w:r>
+        <w:rPr>
+          <w:b w:val="0"/>
+          <w:bCs w:val="0"/>
+          <w:color w:val="auto"/>
+        </w:rPr>
+        <w:t>Future. Delayed</w:t>
+      </w:r>
+      <w:r>
+        <w:rPr>
+          <w:b w:val="0"/>
+          <w:bCs w:val="0"/>
+          <w:color w:val="auto"/>
+        </w:rPr>
+        <w:t xml:space="preserve"> to prevent layout freezing during network simulation calls. Used the </w:t>
+      </w:r>
+      <w:r>
+        <w:rPr>
+          <w:b w:val="0"/>
+          <w:bCs w:val="0"/>
+          <w:color w:val="auto"/>
+        </w:rPr>
+        <w:t>Dart: convert</w:t>
+      </w:r>
+      <w:r>
+        <w:rPr>
+          <w:b w:val="0"/>
+          <w:bCs w:val="0"/>
+          <w:color w:val="auto"/>
+        </w:rPr>
+        <w:t xml:space="preserve"> serialization layer to decode raw structural JSON data streams into presentation-ready card lists</w:t>
       </w:r>
       <w:r>
         <w:t xml:space="preserve">.  </w:t>
@@ -867,7 +1269,16 @@
         <w:pStyle w:val="Heading2"/>
       </w:pPr>
       <w:r>
-        <w:t xml:space="preserve">​Screenshots/Evidence Attached: </w:t>
+        <w:t>​</w:t>
+      </w:r>
+      <w:r>
+        <w:rPr>
+          <w:u w:val="single"/>
+        </w:rPr>
+        <w:t>Screenshots/Evidence Attached</w:t>
+      </w:r>
+      <w:r>
+        <w:t xml:space="preserve">: </w:t>
       </w:r>
     </w:p>
     <w:p>
@@ -1058,7 +1469,19 @@
         <w:pStyle w:val="Heading2"/>
       </w:pPr>
       <w:r>
-        <w:t xml:space="preserve">/Software Used: </w:t>
+        <w:rPr>
+          <w:u w:val="single"/>
+        </w:rPr>
+        <w:t>Tools</w:t>
+      </w:r>
+      <w:r>
+        <w:rPr>
+          <w:u w:val="single"/>
+        </w:rPr>
+        <w:t>/Software Used</w:t>
+      </w:r>
+      <w:r>
+        <w:t xml:space="preserve">: </w:t>
       </w:r>
       <w:r>
         <w:rPr>
@@ -1066,20 +1489,15 @@
           <w:bCs w:val="0"/>
           <w:color w:val="auto"/>
         </w:rPr>
-        <w:t>Android Studio Compiler, Dart Collections API, dart:convert Serialization Library, Chrome/Edge Rendering Engine.</w:t>
-      </w:r>
-    </w:p>
-    <w:p>
-      <w:pPr>
-        <w:pStyle w:val="Heading2"/>
+        <w:t xml:space="preserve">Android Studio Compiler, Dart Collections API, </w:t>
+      </w:r>
+      <w:r>
         <w:rPr>
           <w:b w:val="0"/>
           <w:bCs w:val="0"/>
           <w:color w:val="auto"/>
         </w:rPr>
-      </w:pPr>
-      <w:r>
-        <w:t xml:space="preserve">​Personal Reflection: </w:t>
+        <w:t>Dart: convert</w:t>
       </w:r>
       <w:r>
         <w:rPr>
@@ -1087,6 +1505,36 @@
           <w:bCs w:val="0"/>
           <w:color w:val="auto"/>
         </w:rPr>
+        <w:t xml:space="preserve"> Serialization Library, Chrome/Edge Rendering Engine.</w:t>
+      </w:r>
+    </w:p>
+    <w:p>
+      <w:pPr>
+        <w:pStyle w:val="Heading2"/>
+        <w:rPr>
+          <w:b w:val="0"/>
+          <w:bCs w:val="0"/>
+          <w:color w:val="auto"/>
+        </w:rPr>
+      </w:pPr>
+      <w:r>
+        <w:t>​</w:t>
+      </w:r>
+      <w:r>
+        <w:rPr>
+          <w:u w:val="single"/>
+        </w:rPr>
+        <w:t>Personal Reflection</w:t>
+      </w:r>
+      <w:r>
+        <w:t xml:space="preserve">: </w:t>
+      </w:r>
+      <w:r>
+        <w:rPr>
+          <w:b w:val="0"/>
+          <w:bCs w:val="0"/>
+          <w:color w:val="auto"/>
+        </w:rPr>
         <w:t>Mastering asynchronous JSON decoding completely demystified client-server data synchronization pipelines. I now confidently understand how to decouple rendering views from underlying data models safely.</w:t>
       </w:r>
     </w:p>
@@ -1097,19 +1545,6 @@
       <w:r>
         <w:br/>
       </w:r>
-    </w:p>
-    <w:p>
-      <w:r>
-        <w:br/>
-      </w:r>
-      <w:r>
-        <w:br/>
-      </w:r>
-      <w:r>
-        <w:br/>
-      </w:r>
-    </w:p>
-    <w:p>
       <w:r>
         <w:br w:type="page"/>
       </w:r>
@@ -1117,85 +1552,195 @@
     <w:p>
       <w:pPr>
         <w:pStyle w:val="Heading1"/>
-      </w:pPr>
-      <w:r>
+        <w:rPr>
+          <w:sz w:val="36"/>
+          <w:szCs w:val="36"/>
+          <w:u w:val="single"/>
+        </w:rPr>
+      </w:pPr>
+      <w:r>
+        <w:rPr>
+          <w:sz w:val="36"/>
+          <w:szCs w:val="36"/>
+          <w:u w:val="single"/>
+        </w:rPr>
         <w:lastRenderedPageBreak/>
         <w:t>Week 6: Networking and APIs</w:t>
       </w:r>
     </w:p>
     <w:p>
-      <w:pPr>
-        <w:pStyle w:val="Heading2"/>
-      </w:pPr>
-      <w:r>
-        <w:t>Same as week 1</w:t>
-      </w:r>
-    </w:p>
-    <w:p>
-      <w:r>
-        <w:br/>
-      </w:r>
-      <w:r>
-        <w:br/>
+      <w:r>
+        <w:rPr>
+          <w:b/>
+          <w:bCs/>
+          <w:color w:val="4F81BD" w:themeColor="accent1"/>
+          <w:u w:val="single"/>
+        </w:rPr>
+        <w:t>Practical Activities Undertaken</w:t>
+      </w:r>
+      <w:r>
+        <w:t xml:space="preserve">: Implemented and analyzed client-server architecture frameworks within the mobile application layout. Developed an asynchronous networking pipeline using a mock REST API portal to safely stream external data services into the Vault Student Hub UI. Engineered background task handling using Dart asynchronous routines (async/await) to simulate real-time HTTP GET request operations without blocking the primary user interface thread. Integrated a serialization layer using the </w:t>
+      </w:r>
+      <w:r>
+        <w:t>Dart: convert</w:t>
+      </w:r>
+      <w:r>
+        <w:t xml:space="preserve"> library to safely parse incoming JSON data packets directly into dynamic, responsive interface list elements.  </w:t>
+      </w:r>
+    </w:p>
+    <w:p>
+      <w:pPr>
+        <w:rPr>
+          <w:color w:val="4F81BD" w:themeColor="accent1"/>
+        </w:rPr>
+      </w:pPr>
+      <w:r>
+        <w:t>​</w:t>
+      </w:r>
+      <w:r>
+        <w:rPr>
+          <w:b/>
+          <w:bCs/>
+          <w:color w:val="4F81BD" w:themeColor="accent1"/>
+          <w:u w:val="single"/>
+        </w:rPr>
+        <w:t>Screenshots</w:t>
+      </w:r>
+      <w:r>
+        <w:rPr>
+          <w:color w:val="4F81BD" w:themeColor="accent1"/>
+          <w:u w:val="single"/>
+        </w:rPr>
+        <w:t>:</w:t>
+      </w:r>
+      <w:r>
+        <w:rPr>
+          <w:color w:val="4F81BD" w:themeColor="accent1"/>
+        </w:rPr>
+        <w:t xml:space="preserve"> </w:t>
+      </w:r>
+    </w:p>
+    <w:p>
+      <w:r>
+        <w:rPr>
+          <w:noProof/>
+        </w:rPr>
+        <w:drawing>
+          <wp:inline distT="0" distB="0" distL="0" distR="0" wp14:anchorId="04A2F0AA" wp14:editId="23C8E110">
+            <wp:extent cx="2635385" cy="4559534"/>
+            <wp:effectExtent l="0" t="0" r="0" b="0"/>
+            <wp:docPr id="15" name="Picture 15"/>
+            <wp:cNvGraphicFramePr>
+              <a:graphicFrameLocks xmlns:a="http://schemas.openxmlformats.org/drawingml/2006/main" noChangeAspect="1"/>
+            </wp:cNvGraphicFramePr>
+            <a:graphic xmlns:a="http://schemas.openxmlformats.org/drawingml/2006/main">
+              <a:graphicData uri="http://schemas.openxmlformats.org/drawingml/2006/picture">
+                <pic:pic xmlns:pic="http://schemas.openxmlformats.org/drawingml/2006/picture">
+                  <pic:nvPicPr>
+                    <pic:cNvPr id="15" name="Picture 15"/>
+                    <pic:cNvPicPr/>
+                  </pic:nvPicPr>
+                  <pic:blipFill>
+                    <a:blip r:embed="rId17"/>
+                    <a:stretch>
+                      <a:fillRect/>
+                    </a:stretch>
+                  </pic:blipFill>
+                  <pic:spPr>
+                    <a:xfrm>
+                      <a:off x="0" y="0"/>
+                      <a:ext cx="2635385" cy="4559534"/>
+                    </a:xfrm>
+                    <a:prstGeom prst="rect">
+                      <a:avLst/>
+                    </a:prstGeom>
+                  </pic:spPr>
+                </pic:pic>
+              </a:graphicData>
+            </a:graphic>
+          </wp:inline>
+        </w:drawing>
+      </w:r>
+    </w:p>
+    <w:p>
+      <w:r>
+        <w:t>​</w:t>
+      </w:r>
+      <w:r>
+        <w:rPr>
+          <w:b/>
+          <w:bCs/>
+          <w:color w:val="4F81BD" w:themeColor="accent1"/>
+          <w:u w:val="single"/>
+        </w:rPr>
+        <w:t>Tools/Software Used</w:t>
+      </w:r>
+      <w:r>
+        <w:t xml:space="preserve">: Android Studio IDE, Flutter Framework (Asynchronous Engine), Dart jsonDecode Utilities, Chrome/Edge Browser Emulation.  </w:t>
+      </w:r>
+    </w:p>
+    <w:p>
+      <w:pPr>
+        <w:rPr>
+          <w:color w:val="4F81BD" w:themeColor="accent1"/>
+          <w:sz w:val="24"/>
+          <w:szCs w:val="24"/>
+        </w:rPr>
+      </w:pPr>
+      <w:r>
+        <w:rPr>
+          <w:color w:val="4F81BD" w:themeColor="accent1"/>
+          <w:sz w:val="24"/>
+          <w:szCs w:val="24"/>
+        </w:rPr>
+        <w:t>​</w:t>
+      </w:r>
+      <w:r>
+        <w:rPr>
+          <w:b/>
+          <w:bCs/>
+          <w:color w:val="4F81BD" w:themeColor="accent1"/>
+          <w:sz w:val="24"/>
+          <w:szCs w:val="24"/>
+          <w:u w:val="single"/>
+        </w:rPr>
+        <w:t>Personal Reflection:</w:t>
+      </w:r>
+      <w:r>
+        <w:rPr>
+          <w:color w:val="4F81BD" w:themeColor="accent1"/>
+          <w:sz w:val="24"/>
+          <w:szCs w:val="24"/>
+        </w:rPr>
+        <w:t xml:space="preserve"> </w:t>
+      </w:r>
+    </w:p>
+    <w:p>
+      <w:r>
+        <w:t xml:space="preserve">This week's tasks helped me master how mobile frontends communicate with remote data nodes. Learning to handle JSON streams asynchronously taught me how real-world </w:t>
+      </w:r>
+      <w:r>
+        <w:lastRenderedPageBreak/>
+        <w:t>applications remain smooth and responsive for users while executing complex background network transactions.</w:t>
       </w:r>
     </w:p>
     <w:p/>
-    <w:p>
-      <w:r>
-        <w:br/>
-      </w:r>
-      <w:r>
-        <w:br/>
-      </w:r>
-      <w:r>
-        <w:br/>
-      </w:r>
-    </w:p>
-    <w:p>
-      <w:r>
-        <w:br/>
-      </w:r>
-      <w:r>
-        <w:br/>
-      </w:r>
-      <w:r>
-        <w:br/>
-      </w:r>
-    </w:p>
-    <w:p>
-      <w:r>
-        <w:br/>
-      </w:r>
-      <w:r>
-        <w:br/>
-      </w:r>
-    </w:p>
-    <w:p>
-      <w:r>
-        <w:br/>
-      </w:r>
-    </w:p>
-    <w:p>
-      <w:r>
-        <w:br/>
-      </w:r>
-      <w:r>
-        <w:br/>
-      </w:r>
-      <w:r>
-        <w:br/>
-      </w:r>
-    </w:p>
-    <w:p>
-      <w:r>
-        <w:br w:type="page"/>
-      </w:r>
-    </w:p>
+    <w:p/>
     <w:p>
       <w:pPr>
         <w:pStyle w:val="Heading1"/>
-      </w:pPr>
-      <w:r>
+        <w:rPr>
+          <w:sz w:val="32"/>
+          <w:szCs w:val="32"/>
+          <w:u w:val="single"/>
+        </w:rPr>
+      </w:pPr>
+      <w:r>
+        <w:rPr>
+          <w:sz w:val="32"/>
+          <w:szCs w:val="32"/>
+          <w:u w:val="single"/>
+        </w:rPr>
         <w:lastRenderedPageBreak/>
         <w:t>Week 7: Application Architecture</w:t>
       </w:r>
@@ -1205,29 +1750,296 @@
         <w:pStyle w:val="Heading2"/>
       </w:pPr>
       <w:r>
-        <w:t>Same as week 1</w:t>
-      </w:r>
-    </w:p>
-    <w:p>
-      <w:r>
-        <w:br/>
-      </w:r>
-      <w:r>
-        <w:br/>
-      </w:r>
-    </w:p>
-    <w:p>
-      <w:r>
-        <w:br/>
-      </w:r>
-      <w:r>
-        <w:br/>
+        <w:rPr>
+          <w:color w:val="4F81BD" w:themeColor="accent1"/>
+          <w:u w:val="single"/>
+        </w:rPr>
+        <w:t>Practical Activities Undertaken</w:t>
+      </w:r>
+      <w:r>
+        <w:t xml:space="preserve">: </w:t>
+      </w:r>
+      <w:r>
+        <w:rPr>
+          <w:b w:val="0"/>
+          <w:bCs w:val="0"/>
+          <w:color w:val="auto"/>
+        </w:rPr>
+        <w:t>Designed and integrated a localized relational database schema to support the core student management and attendance tracking modules of the Vault Student Hub app. Evaluated different data persistence methods (Shared Preferences vs. SQLite) and chose an embedded relational file structure to ensure complete offline usability. Structured the entity layout into Third Normal Form (3NF) to optimize indexing speeds, utilizing a primary key unique constraint (student_id) linked relationally via a foreign key to a daily class attendance ledger. Implemented the local relational simulation data state engine within Flutter to handle programmatic validation and execution of data creation and retrieval routines.</w:t>
+      </w:r>
+      <w:r>
+        <w:rPr>
+          <w:color w:val="auto"/>
+        </w:rPr>
+        <w:t xml:space="preserve">  </w:t>
       </w:r>
     </w:p>
     <w:p>
       <w:pPr>
         <w:pStyle w:val="Heading2"/>
-      </w:pPr>
+        <w:rPr>
+          <w:color w:val="4F81BD" w:themeColor="accent1"/>
+          <w:u w:val="single"/>
+        </w:rPr>
+      </w:pPr>
+      <w:r>
+        <w:t>​</w:t>
+      </w:r>
+      <w:r>
+        <w:rPr>
+          <w:color w:val="4F81BD" w:themeColor="accent1"/>
+          <w:u w:val="single"/>
+        </w:rPr>
+        <w:t>Screenshots</w:t>
+      </w:r>
+    </w:p>
+    <w:p>
+      <w:r>
+        <w:rPr>
+          <w:noProof/>
+        </w:rPr>
+        <w:drawing>
+          <wp:inline distT="0" distB="0" distL="0" distR="0" wp14:anchorId="50DCDC61" wp14:editId="37FBFC3C">
+            <wp:extent cx="2502029" cy="4654789"/>
+            <wp:effectExtent l="0" t="0" r="0" b="0"/>
+            <wp:docPr id="2" name="Picture 2"/>
+            <wp:cNvGraphicFramePr>
+              <a:graphicFrameLocks xmlns:a="http://schemas.openxmlformats.org/drawingml/2006/main" noChangeAspect="1"/>
+            </wp:cNvGraphicFramePr>
+            <a:graphic xmlns:a="http://schemas.openxmlformats.org/drawingml/2006/main">
+              <a:graphicData uri="http://schemas.openxmlformats.org/drawingml/2006/picture">
+                <pic:pic xmlns:pic="http://schemas.openxmlformats.org/drawingml/2006/picture">
+                  <pic:nvPicPr>
+                    <pic:cNvPr id="2" name="Picture 2"/>
+                    <pic:cNvPicPr/>
+                  </pic:nvPicPr>
+                  <pic:blipFill>
+                    <a:blip r:embed="rId18"/>
+                    <a:stretch>
+                      <a:fillRect/>
+                    </a:stretch>
+                  </pic:blipFill>
+                  <pic:spPr>
+                    <a:xfrm>
+                      <a:off x="0" y="0"/>
+                      <a:ext cx="2502029" cy="4654789"/>
+                    </a:xfrm>
+                    <a:prstGeom prst="rect">
+                      <a:avLst/>
+                    </a:prstGeom>
+                  </pic:spPr>
+                </pic:pic>
+              </a:graphicData>
+            </a:graphic>
+          </wp:inline>
+        </w:drawing>
+      </w:r>
+    </w:p>
+    <w:p>
+      <w:r>
+        <w:rPr>
+          <w:noProof/>
+        </w:rPr>
+        <w:lastRenderedPageBreak/>
+        <w:drawing>
+          <wp:inline distT="0" distB="0" distL="0" distR="0" wp14:anchorId="1BF7304F" wp14:editId="5F48709E">
+            <wp:extent cx="2571882" cy="4629388"/>
+            <wp:effectExtent l="0" t="0" r="0" b="0"/>
+            <wp:docPr id="12" name="Picture 12"/>
+            <wp:cNvGraphicFramePr>
+              <a:graphicFrameLocks xmlns:a="http://schemas.openxmlformats.org/drawingml/2006/main" noChangeAspect="1"/>
+            </wp:cNvGraphicFramePr>
+            <a:graphic xmlns:a="http://schemas.openxmlformats.org/drawingml/2006/main">
+              <a:graphicData uri="http://schemas.openxmlformats.org/drawingml/2006/picture">
+                <pic:pic xmlns:pic="http://schemas.openxmlformats.org/drawingml/2006/picture">
+                  <pic:nvPicPr>
+                    <pic:cNvPr id="12" name="Picture 12"/>
+                    <pic:cNvPicPr/>
+                  </pic:nvPicPr>
+                  <pic:blipFill>
+                    <a:blip r:embed="rId19"/>
+                    <a:stretch>
+                      <a:fillRect/>
+                    </a:stretch>
+                  </pic:blipFill>
+                  <pic:spPr>
+                    <a:xfrm>
+                      <a:off x="0" y="0"/>
+                      <a:ext cx="2571882" cy="4629388"/>
+                    </a:xfrm>
+                    <a:prstGeom prst="rect">
+                      <a:avLst/>
+                    </a:prstGeom>
+                  </pic:spPr>
+                </pic:pic>
+              </a:graphicData>
+            </a:graphic>
+          </wp:inline>
+        </w:drawing>
+      </w:r>
+    </w:p>
+    <w:p/>
+    <w:p>
+      <w:r>
+        <w:rPr>
+          <w:noProof/>
+        </w:rPr>
+        <w:lastRenderedPageBreak/>
+        <w:drawing>
+          <wp:inline distT="0" distB="0" distL="0" distR="0" wp14:anchorId="222E078B" wp14:editId="7F78956C">
+            <wp:extent cx="2444876" cy="4483330"/>
+            <wp:effectExtent l="0" t="0" r="0" b="0"/>
+            <wp:docPr id="13" name="Picture 13"/>
+            <wp:cNvGraphicFramePr>
+              <a:graphicFrameLocks xmlns:a="http://schemas.openxmlformats.org/drawingml/2006/main" noChangeAspect="1"/>
+            </wp:cNvGraphicFramePr>
+            <a:graphic xmlns:a="http://schemas.openxmlformats.org/drawingml/2006/main">
+              <a:graphicData uri="http://schemas.openxmlformats.org/drawingml/2006/picture">
+                <pic:pic xmlns:pic="http://schemas.openxmlformats.org/drawingml/2006/picture">
+                  <pic:nvPicPr>
+                    <pic:cNvPr id="13" name="Picture 13"/>
+                    <pic:cNvPicPr/>
+                  </pic:nvPicPr>
+                  <pic:blipFill>
+                    <a:blip r:embed="rId20"/>
+                    <a:stretch>
+                      <a:fillRect/>
+                    </a:stretch>
+                  </pic:blipFill>
+                  <pic:spPr>
+                    <a:xfrm>
+                      <a:off x="0" y="0"/>
+                      <a:ext cx="2444876" cy="4483330"/>
+                    </a:xfrm>
+                    <a:prstGeom prst="rect">
+                      <a:avLst/>
+                    </a:prstGeom>
+                  </pic:spPr>
+                </pic:pic>
+              </a:graphicData>
+            </a:graphic>
+          </wp:inline>
+        </w:drawing>
+      </w:r>
+    </w:p>
+    <w:p>
+      <w:r>
+        <w:rPr>
+          <w:noProof/>
+        </w:rPr>
+        <w:lastRenderedPageBreak/>
+        <w:drawing>
+          <wp:inline distT="0" distB="0" distL="0" distR="0" wp14:anchorId="3F8DD812" wp14:editId="0229B3E7">
+            <wp:extent cx="2578233" cy="4521432"/>
+            <wp:effectExtent l="0" t="0" r="0" b="0"/>
+            <wp:docPr id="14" name="Picture 14"/>
+            <wp:cNvGraphicFramePr>
+              <a:graphicFrameLocks xmlns:a="http://schemas.openxmlformats.org/drawingml/2006/main" noChangeAspect="1"/>
+            </wp:cNvGraphicFramePr>
+            <a:graphic xmlns:a="http://schemas.openxmlformats.org/drawingml/2006/main">
+              <a:graphicData uri="http://schemas.openxmlformats.org/drawingml/2006/picture">
+                <pic:pic xmlns:pic="http://schemas.openxmlformats.org/drawingml/2006/picture">
+                  <pic:nvPicPr>
+                    <pic:cNvPr id="14" name="Picture 14"/>
+                    <pic:cNvPicPr/>
+                  </pic:nvPicPr>
+                  <pic:blipFill>
+                    <a:blip r:embed="rId21"/>
+                    <a:stretch>
+                      <a:fillRect/>
+                    </a:stretch>
+                  </pic:blipFill>
+                  <pic:spPr>
+                    <a:xfrm>
+                      <a:off x="0" y="0"/>
+                      <a:ext cx="2578233" cy="4521432"/>
+                    </a:xfrm>
+                    <a:prstGeom prst="rect">
+                      <a:avLst/>
+                    </a:prstGeom>
+                  </pic:spPr>
+                </pic:pic>
+              </a:graphicData>
+            </a:graphic>
+          </wp:inline>
+        </w:drawing>
+      </w:r>
+    </w:p>
+    <w:p>
+      <w:pPr>
+        <w:pStyle w:val="Heading2"/>
+        <w:rPr>
+          <w:b w:val="0"/>
+          <w:bCs w:val="0"/>
+          <w:color w:val="auto"/>
+        </w:rPr>
+      </w:pPr>
+      <w:r>
+        <w:t>​</w:t>
+      </w:r>
+      <w:r>
+        <w:rPr>
+          <w:color w:val="4F81BD" w:themeColor="accent1"/>
+          <w:u w:val="single"/>
+        </w:rPr>
+        <w:t>Tools/Software Used</w:t>
+      </w:r>
+      <w:r>
+        <w:rPr>
+          <w:color w:val="auto"/>
+        </w:rPr>
+        <w:t>:</w:t>
+      </w:r>
+      <w:r>
+        <w:t xml:space="preserve"> </w:t>
+      </w:r>
+      <w:r>
+        <w:rPr>
+          <w:b w:val="0"/>
+          <w:bCs w:val="0"/>
+          <w:color w:val="auto"/>
+        </w:rPr>
+        <w:t>Android Studio IDE, Flutter Framework (Relational State Subsystems), Dart Data Structures, Microsoft Edge Viewport Emulator.</w:t>
+      </w:r>
+    </w:p>
+    <w:p>
+      <w:pPr>
+        <w:pStyle w:val="Heading2"/>
+      </w:pPr>
+      <w:r>
+        <w:t>​</w:t>
+      </w:r>
+      <w:r>
+        <w:rPr>
+          <w:color w:val="4F81BD" w:themeColor="accent1"/>
+          <w:u w:val="single"/>
+        </w:rPr>
+        <w:t>Personal Reflection:</w:t>
+      </w:r>
+      <w:r>
+        <w:rPr>
+          <w:color w:val="4F81BD" w:themeColor="accent1"/>
+        </w:rPr>
+        <w:t xml:space="preserve"> </w:t>
+      </w:r>
+    </w:p>
+    <w:p>
+      <w:pPr>
+        <w:pStyle w:val="Heading2"/>
+        <w:rPr>
+          <w:b w:val="0"/>
+          <w:bCs w:val="0"/>
+          <w:color w:val="auto"/>
+        </w:rPr>
+      </w:pPr>
+      <w:r>
+        <w:rPr>
+          <w:b w:val="0"/>
+          <w:bCs w:val="0"/>
+          <w:color w:val="auto"/>
+        </w:rPr>
+        <w:t>Learning to design relational schemas and map them directly into a mobile interface taught me the importance of data persistence. Implementing offline capabilities ensures the application remains fully functional and reliable in environments with limited or unstable network connectivity.</w:t>
+      </w:r>
     </w:p>
     <w:p>
       <w:r>

</xml_diff>